<commit_message>
feat(Admin): Implement admin controller
</commit_message>
<xml_diff>
--- a/Documentation/UseCases/Use Cases.docx
+++ b/Documentation/UseCases/Use Cases.docx
@@ -75,6 +75,14 @@
         </w:rPr>
         <w:t xml:space="preserve"> </w:t>
       </w:r>
+      <w:r>
+        <w:rPr>
+          <w:rFonts w:ascii="Segoe UI Symbol" w:hAnsi="Segoe UI Symbol" w:cs="Segoe UI Symbol"/>
+          <w:sz w:val="40"/>
+          <w:szCs w:val="40"/>
+        </w:rPr>
+        <w:t>✔️</w:t>
+      </w:r>
     </w:p>
     <w:p>
       <w:pPr>
@@ -95,6 +103,14 @@
         </w:rPr>
         <w:t xml:space="preserve">Login </w:t>
       </w:r>
+      <w:r>
+        <w:rPr>
+          <w:rFonts w:ascii="Segoe UI Symbol" w:hAnsi="Segoe UI Symbol" w:cs="Segoe UI Symbol"/>
+          <w:sz w:val="40"/>
+          <w:szCs w:val="40"/>
+        </w:rPr>
+        <w:t>✔️</w:t>
+      </w:r>
     </w:p>
     <w:p>
       <w:pPr>
@@ -152,6 +168,14 @@
         </w:rPr>
         <w:t xml:space="preserve"> </w:t>
       </w:r>
+      <w:r>
+        <w:rPr>
+          <w:rFonts w:ascii="Segoe UI Symbol" w:hAnsi="Segoe UI Symbol" w:cs="Segoe UI Symbol"/>
+          <w:sz w:val="40"/>
+          <w:szCs w:val="40"/>
+        </w:rPr>
+        <w:t>✔️</w:t>
+      </w:r>
     </w:p>
     <w:p>
       <w:pPr>
@@ -193,6 +217,14 @@
         </w:rPr>
         <w:t xml:space="preserve"> </w:t>
       </w:r>
+      <w:r>
+        <w:rPr>
+          <w:rFonts w:ascii="Segoe UI Emoji" w:hAnsi="Segoe UI Emoji" w:cs="Segoe UI Emoji"/>
+          <w:sz w:val="40"/>
+          <w:szCs w:val="40"/>
+        </w:rPr>
+        <w:t>❌</w:t>
+      </w:r>
     </w:p>
     <w:p>
       <w:pPr>
@@ -232,12 +264,14 @@
           <w:numId w:val="4"/>
         </w:numPr>
         <w:rPr>
-          <w:sz w:val="40"/>
-          <w:szCs w:val="40"/>
-        </w:rPr>
-      </w:pPr>
-      <w:r>
-        <w:rPr>
+          <w:strike/>
+          <w:sz w:val="40"/>
+          <w:szCs w:val="40"/>
+        </w:rPr>
+      </w:pPr>
+      <w:r>
+        <w:rPr>
+          <w:strike/>
           <w:sz w:val="40"/>
           <w:szCs w:val="40"/>
         </w:rPr>
@@ -245,6 +279,7 @@
       </w:r>
       <w:r>
         <w:rPr>
+          <w:strike/>
           <w:sz w:val="40"/>
           <w:szCs w:val="40"/>
         </w:rPr>
@@ -517,7 +552,6 @@
           <w:sz w:val="40"/>
           <w:szCs w:val="40"/>
         </w:rPr>
-        <w:lastRenderedPageBreak/>
         <w:t>(Add, Edit, Delete) Payment Methods</w:t>
       </w:r>
       <w:r>
@@ -955,7 +989,7 @@
           <w:sz w:val="40"/>
           <w:szCs w:val="40"/>
         </w:rPr>
-        <w:t xml:space="preserve">(View, Ban, Edit) </w:t>
+        <w:t xml:space="preserve">(View, Ban) </w:t>
       </w:r>
       <w:r>
         <w:rPr>
@@ -977,6 +1011,21 @@
           <w:szCs w:val="40"/>
         </w:rPr>
         <w:t xml:space="preserve"> / Vendors</w:t>
+      </w:r>
+      <w:r>
+        <w:rPr>
+          <w:sz w:val="40"/>
+          <w:szCs w:val="40"/>
+        </w:rPr>
+        <w:t xml:space="preserve"> </w:t>
+      </w:r>
+      <w:r>
+        <w:rPr>
+          <w:rFonts w:ascii="Segoe UI Symbol" w:hAnsi="Segoe UI Symbol" w:cs="Segoe UI Symbol"/>
+          <w:sz w:val="40"/>
+          <w:szCs w:val="40"/>
+        </w:rPr>
+        <w:t>✔️</w:t>
       </w:r>
     </w:p>
     <w:p>

</xml_diff>